<commit_message>
Add generated monogram icons, text-only social image, photo-free CV source
Completes the photo removal: the icon files deleted earlier are now
generated from the SR monogram, and the CV .docx no longer embeds a photo.

Co-Authored-By: Claude Opus 5.5 <noreply@anthropic.com>
</commit_message>
<xml_diff>
--- a/docs/Sokny-Ran-CV.docx
+++ b/docs/Sokny-Ran-CV.docx
@@ -16,13 +16,12 @@
         <w:tblLayout w:type="fixed"/>
       </w:tblPr>
       <w:tblGrid>
-        <w:gridCol w:w="8504"/>
-        <w:gridCol w:w="1814"/>
+        <w:gridCol w:w="10318"/>
       </w:tblGrid>
       <w:tr>
         <w:tc>
           <w:tcPr>
-            <w:tcW w:type="dxa" w:w="8504"/>
+            <w:tcW w:type="dxa" w:w="10318"/>
             <w:tcBorders>
               <w:top w:val="none" w:color="FFFFFF" w:sz="0"/>
               <w:left w:val="none" w:color="FFFFFF" w:sz="0"/>
@@ -141,70 +140,6 @@
                 <w:t xml:space="preserve">github.com/soknyran</w:t>
               </w:r>
             </w:hyperlink>
-          </w:p>
-        </w:tc>
-        <w:tc>
-          <w:tcPr>
-            <w:tcW w:type="dxa" w:w="1814"/>
-            <w:tcBorders>
-              <w:top w:val="none" w:color="FFFFFF" w:sz="0"/>
-              <w:left w:val="none" w:color="FFFFFF" w:sz="0"/>
-              <w:bottom w:val="none" w:color="FFFFFF" w:sz="0"/>
-              <w:right w:val="none" w:color="FFFFFF" w:sz="0"/>
-            </w:tcBorders>
-            <w:shd w:fill="FFFFFF" w:color="auto" w:val="clear"/>
-            <w:tcMar>
-              <w:top w:type="dxa" w:w="0"/>
-              <w:left w:type="dxa" w:w="0"/>
-              <w:bottom w:type="dxa" w:w="0"/>
-              <w:right w:type="dxa" w:w="0"/>
-            </w:tcMar>
-            <w:vAlign w:val="center"/>
-          </w:tcPr>
-          <w:p>
-            <w:pPr>
-              <w:jc w:val="right"/>
-            </w:pPr>
-            <w:r>
-              <w:drawing>
-                <wp:inline distT="0" distB="0" distL="0" distR="0">
-                  <wp:extent cx="1076325" cy="1076325"/>
-                  <wp:effectExtent t="0" r="0" b="0" l="0"/>
-                  <wp:docPr id="1" name="Sokny Ran" descr="Profile photo of Sokny Ran" title="Sokny Ran"/>
-                  <wp:cNvGraphicFramePr>
-                    <a:graphicFrameLocks xmlns:a="http://schemas.openxmlformats.org/drawingml/2006/main" noChangeAspect="1"/>
-                  </wp:cNvGraphicFramePr>
-                  <a:graphic xmlns:a="http://schemas.openxmlformats.org/drawingml/2006/main">
-                    <a:graphicData uri="http://schemas.openxmlformats.org/drawingml/2006/picture">
-                      <pic:pic xmlns:pic="http://schemas.openxmlformats.org/drawingml/2006/picture">
-                        <pic:nvPicPr>
-                          <pic:cNvPr id="0" name="" descr=""/>
-                          <pic:cNvPicPr>
-                            <a:picLocks noChangeAspect="1" noChangeArrowheads="1"/>
-                          </pic:cNvPicPr>
-                        </pic:nvPicPr>
-                        <pic:blipFill>
-                          <a:blip r:embed="rId7" cstate="none"/>
-                          <a:srcRect/>
-                          <a:stretch>
-                            <a:fillRect/>
-                          </a:stretch>
-                        </pic:blipFill>
-                        <pic:spPr bwMode="auto">
-                          <a:xfrm>
-                            <a:off x="0" y="0"/>
-                            <a:ext cx="1076325" cy="1076325"/>
-                          </a:xfrm>
-                          <a:prstGeom prst="rect">
-                            <a:avLst/>
-                          </a:prstGeom>
-                        </pic:spPr>
-                      </pic:pic>
-                    </a:graphicData>
-                  </a:graphic>
-                </wp:inline>
-              </w:drawing>
-            </w:r>
           </w:p>
         </w:tc>
       </w:tr>

</xml_diff>